<commit_message>
Adiciona campo de vigência (período de duração) do contrato
</commit_message>
<xml_diff>
--- a/modelo/modelo_contrato.docx
+++ b/modelo/modelo_contrato.docx
@@ -118,7 +118,18 @@
           <w:sz w:val="20"/>
           <w:lang w:eastAsia="pt-BR"/>
         </w:rPr>
-        <w:t xml:space="preserve">, CANDIDATO sobre o número 10456 com endereço na rua </w:t>
+        <w:t xml:space="preserve">, CANDIDATO sob</w:t>
+      </w:r>
+      <w:bookmarkStart w:id="0" w:name="_GoBack"/>
+      <w:bookmarkEnd w:id="0"/>
+      <w:r>
+        <w:rPr>
+          <w:rFonts w:ascii="Arial" w:eastAsia="Times New Roman" w:hAnsi="Arial" w:cs="Arial"/>
+          <w:color w:val="000000"/>
+          <w:sz w:val="20"/>
+          <w:lang w:eastAsia="pt-BR"/>
+        </w:rPr>
+        <w:t xml:space="preserve"> o número 10456 com endereço na rua </w:t>
       </w:r>
       <w:r>
         <w:t>DOM PEDRO II</w:t>
@@ -215,8 +226,6 @@
         </w:rPr>
         <w:t xml:space="preserve"> {{ endereco_contratado }}</w:t>
       </w:r>
-      <w:bookmarkStart w:id="0" w:name="_GoBack"/>
-      <w:bookmarkEnd w:id="0"/>
       <w:r>
         <w:rPr>
           <w:rFonts w:ascii="Arial" w:eastAsia="Times New Roman" w:hAnsi="Arial" w:cs="Arial"/>
@@ -604,7 +613,7 @@
           <w:sz w:val="20"/>
           <w:lang w:eastAsia="pt-BR"/>
         </w:rPr>
-        <w:t>– O presente contrato terá vigência da data de sua ratificação até 04.10.2026, sem qualquer cláusula de prorrogação, encerrando-se imediatamente após o transcurso do prazo.</w:t>
+        <w:t>– O presente contrato terá vigência da data de sua ratificação até {{ data_fim }}, sem qualquer cláusula de prorrogação, encerrando-se imediatamente após o transcurso do prazo.</w:t>
       </w:r>
     </w:p>
     <w:p>

</xml_diff>

<commit_message>
Substitui clausula de horario fixo/variavel por clausula de servicos de militancia com paragrafos de atividades extraordinarias
</commit_message>
<xml_diff>
--- a/modelo/modelo_contrato.docx
+++ b/modelo/modelo_contrato.docx
@@ -355,16 +355,7 @@
           <w:sz w:val="20"/>
           <w:lang w:eastAsia="pt-BR"/>
         </w:rPr>
-        <w:t xml:space="preserve">– O(A) CONTRATADO(A) prestará os seus serviços de SEGUNDA -feira a SÁBADO, das </w:t>
-      </w:r>
-      <w:r>
-        <w:rPr>
-          <w:rFonts w:ascii="Arial" w:eastAsia="Times New Roman" w:hAnsi="Arial" w:cs="Arial"/>
-          <w:color w:val="000000"/>
-          <w:sz w:val="20"/>
-          <w:lang w:eastAsia="pt-BR"/>
-        </w:rPr>
-        <w:t>{{ horario_semanal }}, e aos {{ horario_fds }}.</w:t>
+        <w:t xml:space="preserve">– O(A) CONTRATADO(A) prestará os serviços de militância objeto deste contrato de segunda-feira a sábado, no horário compreendido das 13h00 às 18h00, observadas as orientações e o cronograma de atividades estabelecido pelo CONTRATANTE.</w:t>
       </w:r>
     </w:p>
     <w:p>
@@ -373,6 +364,7 @@
         <w:jc w:val="both"/>
         <w:rPr>
           <w:rFonts w:ascii="Arial" w:eastAsia="Times New Roman" w:hAnsi="Arial" w:cs="Arial"/>
+          <w:color w:val="000000"/>
           <w:sz w:val="20"/>
           <w:lang w:eastAsia="pt-BR"/>
         </w:rPr>
@@ -396,79 +388,16 @@
           <w:sz w:val="20"/>
           <w:lang w:eastAsia="pt-BR"/>
         </w:rPr>
-        <w:t>Parágrafo 1º</w:t>
-      </w:r>
-      <w:r>
-        <w:rPr>
-          <w:rFonts w:ascii="Arial" w:eastAsia="Times New Roman" w:hAnsi="Arial" w:cs="Arial"/>
-          <w:color w:val="000000"/>
-          <w:sz w:val="20"/>
-          <w:lang w:eastAsia="pt-BR"/>
-        </w:rPr>
-        <w:t>. O(A) CONTRATADO(A) aceita desde já, expressamente, a condição de prestar os serviços,</w:t>
-      </w:r>
-      <w:r>
-        <w:rPr>
-          <w:rFonts w:ascii="Arial" w:eastAsia="Times New Roman" w:hAnsi="Arial" w:cs="Arial"/>
-          <w:color w:val="000000"/>
-          <w:sz w:val="20"/>
-          <w:szCs w:val="20"/>
-          <w:lang w:eastAsia="pt-BR"/>
-        </w:rPr>
-        <w:br/>
-      </w:r>
-      <w:r>
-        <w:rPr>
-          <w:rFonts w:ascii="Arial" w:eastAsia="Times New Roman" w:hAnsi="Arial" w:cs="Arial"/>
-          <w:color w:val="000000"/>
-          <w:sz w:val="20"/>
-          <w:lang w:eastAsia="pt-BR"/>
-        </w:rPr>
-        <w:t>tarefas ou atividades voltadas à Campanha Eleitoral, em qualquer turno de trabalho, seja pela manhã, tarde</w:t>
-      </w:r>
-      <w:r>
-        <w:rPr>
-          <w:rFonts w:ascii="Arial" w:eastAsia="Times New Roman" w:hAnsi="Arial" w:cs="Arial"/>
-          <w:color w:val="000000"/>
-          <w:sz w:val="20"/>
-          <w:szCs w:val="20"/>
-          <w:lang w:eastAsia="pt-BR"/>
-        </w:rPr>
-        <w:br/>
-      </w:r>
-      <w:r>
-        <w:rPr>
-          <w:rFonts w:ascii="Arial" w:eastAsia="Times New Roman" w:hAnsi="Arial" w:cs="Arial"/>
-          <w:color w:val="000000"/>
-          <w:sz w:val="20"/>
-          <w:lang w:eastAsia="pt-BR"/>
-        </w:rPr>
-        <w:t xml:space="preserve">ou noite, em feriados e/ou finais de </w:t>
-      </w:r>
-      <w:r>
-        <w:rPr>
-          <w:rFonts w:ascii="Arial" w:eastAsia="Times New Roman" w:hAnsi="Arial" w:cs="Arial"/>
-          <w:sz w:val="20"/>
-          <w:lang w:eastAsia="pt-BR"/>
-        </w:rPr>
-        <w:t xml:space="preserve">semana </w:t>
-      </w:r>
-      <w:r>
-        <w:rPr>
-          <w:rFonts w:ascii="Arial" w:hAnsi="Arial" w:cs="Arial"/>
-          <w:sz w:val="20"/>
-          <w:szCs w:val="20"/>
-          <w:shd w:val="clear" w:color="auto" w:fill="FFFFFF"/>
-        </w:rPr>
-        <w:t>conforme cronograma de atividades ou a necessidade do CONTRATANTE durante a Campanha Eleitoral 2026</w:t>
-      </w:r>
-      <w:r>
-        <w:rPr>
-          <w:rFonts w:ascii="Arial" w:eastAsia="Times New Roman" w:hAnsi="Arial" w:cs="Arial"/>
-          <w:sz w:val="20"/>
-          <w:lang w:eastAsia="pt-BR"/>
-        </w:rPr>
-        <w:t>.</w:t>
+        <w:t xml:space="preserve">Parágrafo Primeiro</w:t>
+      </w:r>
+      <w:r>
+        <w:rPr>
+          <w:rFonts w:ascii="Arial" w:eastAsia="Times New Roman" w:hAnsi="Arial" w:cs="Arial"/>
+          <w:color w:val="000000"/>
+          <w:sz w:val="20"/>
+          <w:lang w:eastAsia="pt-BR"/>
+        </w:rPr>
+        <w:t xml:space="preserve">. Além do período ordinário acima estabelecido, o(a) CONTRATADO(A) poderá ser solicitado(a) a participar de atividades extraordinárias e demais atos relacionados à campanha eleitoral, conforme cronograma de campanha.</w:t>
       </w:r>
     </w:p>
     <w:p>
@@ -501,35 +430,16 @@
           <w:sz w:val="20"/>
           <w:lang w:eastAsia="pt-BR"/>
         </w:rPr>
-        <w:t>Parágrafo 2º</w:t>
-      </w:r>
-      <w:r>
-        <w:rPr>
-          <w:rFonts w:ascii="Arial" w:eastAsia="Times New Roman" w:hAnsi="Arial" w:cs="Arial"/>
-          <w:color w:val="000000"/>
-          <w:sz w:val="20"/>
-          <w:lang w:eastAsia="pt-BR"/>
-        </w:rPr>
-        <w:t>. Nas situações previstas no parágrafo anterior, haverá compensação das horas ajustadas ou</w:t>
-      </w:r>
-      <w:r>
-        <w:rPr>
-          <w:rFonts w:ascii="Arial" w:eastAsia="Times New Roman" w:hAnsi="Arial" w:cs="Arial"/>
-          <w:color w:val="000000"/>
-          <w:sz w:val="20"/>
-          <w:szCs w:val="20"/>
-          <w:lang w:eastAsia="pt-BR"/>
-        </w:rPr>
-        <w:br/>
-      </w:r>
-      <w:r>
-        <w:rPr>
-          <w:rFonts w:ascii="Arial" w:eastAsia="Times New Roman" w:hAnsi="Arial" w:cs="Arial"/>
-          <w:color w:val="000000"/>
-          <w:sz w:val="20"/>
-          <w:lang w:eastAsia="pt-BR"/>
-        </w:rPr>
-        <w:t>pagamento da carga horária excedente.</w:t>
+        <w:t xml:space="preserve">Parágrafo Segundo</w:t>
+      </w:r>
+      <w:r>
+        <w:rPr>
+          <w:rFonts w:ascii="Arial" w:eastAsia="Times New Roman" w:hAnsi="Arial" w:cs="Arial"/>
+          <w:color w:val="000000"/>
+          <w:sz w:val="20"/>
+          <w:lang w:eastAsia="pt-BR"/>
+        </w:rPr>
+        <w:t xml:space="preserve">. As atividades extraordinárias serão realizadas mediante prévio ajuste e concordância entre as partes, considerando o cronograma de atividades da campanha e as necessidades de execução dos serviços contratados.</w:t>
       </w:r>
     </w:p>
     <w:p>
@@ -562,16 +472,16 @@
           <w:sz w:val="20"/>
           <w:lang w:eastAsia="pt-BR"/>
         </w:rPr>
-        <w:t>Parágrafo 3º</w:t>
-      </w:r>
-      <w:r>
-        <w:rPr>
-          <w:rFonts w:ascii="Arial" w:eastAsia="Times New Roman" w:hAnsi="Arial" w:cs="Arial"/>
-          <w:color w:val="000000"/>
-          <w:sz w:val="20"/>
-          <w:lang w:eastAsia="pt-BR"/>
-        </w:rPr>
-        <w:t>. As faltas serão compensadas ou descontadas, conforme entendimento entre as partes.</w:t>
+        <w:t xml:space="preserve">Parágrafo Terceiro</w:t>
+      </w:r>
+      <w:r>
+        <w:rPr>
+          <w:rFonts w:ascii="Arial" w:eastAsia="Times New Roman" w:hAnsi="Arial" w:cs="Arial"/>
+          <w:color w:val="000000"/>
+          <w:sz w:val="20"/>
+          <w:lang w:eastAsia="pt-BR"/>
+        </w:rPr>
+        <w:t xml:space="preserve">. A realização de atividades extraordinárias não implica alteração do objeto ou do valor da contratação, salvo se houver ajuste expresso entre as partes, formalizado por escrito, quando aplicável.</w:t>
       </w:r>
     </w:p>
     <w:p>

</xml_diff>

<commit_message>
Atualiza timbre do cabecalho (centralizado/ajustado)
</commit_message>
<xml_diff>
--- a/modelo/modelo_contrato.docx
+++ b/modelo/modelo_contrato.docx
@@ -75,6 +75,8 @@
           <w:lang w:eastAsia="pt-BR"/>
         </w:rPr>
       </w:pPr>
+      <w:bookmarkStart w:id="0" w:name="_GoBack"/>
+      <w:bookmarkEnd w:id="0"/>
     </w:p>
     <w:p>
       <w:pPr>
@@ -1103,8 +1105,6 @@
           <w:lang w:eastAsia="pt-BR"/>
         </w:rPr>
       </w:pPr>
-      <w:bookmarkStart w:id="0" w:name="_GoBack"/>
-      <w:bookmarkEnd w:id="0"/>
     </w:p>
     <w:p>
       <w:pPr>
@@ -1687,10 +1687,10 @@
         <w:lang w:eastAsia="pt-BR"/>
       </w:rPr>
       <w:drawing>
-        <wp:anchor distT="0" distB="0" distL="114300" distR="114300" simplePos="0" relativeHeight="251660288" behindDoc="0" locked="0" layoutInCell="1" allowOverlap="1" wp14:anchorId="5D348CA9" wp14:editId="440511ED">
+        <wp:anchor distT="0" distB="0" distL="114300" distR="114300" simplePos="0" relativeHeight="251660288" behindDoc="0" locked="0" layoutInCell="1" allowOverlap="1" wp14:anchorId="5D348CA9" wp14:editId="6FBE6C62">
           <wp:simplePos x="0" y="0"/>
           <wp:positionH relativeFrom="column">
-            <wp:posOffset>4539615</wp:posOffset>
+            <wp:posOffset>4749165</wp:posOffset>
           </wp:positionH>
           <wp:positionV relativeFrom="paragraph">
             <wp:posOffset>-288290</wp:posOffset>
@@ -1748,10 +1748,10 @@
         <w:lang w:eastAsia="pt-BR"/>
       </w:rPr>
       <w:drawing>
-        <wp:anchor distT="0" distB="0" distL="114300" distR="114300" simplePos="0" relativeHeight="251659264" behindDoc="0" locked="0" layoutInCell="1" allowOverlap="1" wp14:anchorId="118D8578" wp14:editId="7D46144C">
+        <wp:anchor distT="0" distB="0" distL="114300" distR="114300" simplePos="0" relativeHeight="251659264" behindDoc="0" locked="0" layoutInCell="1" allowOverlap="1" wp14:anchorId="118D8578" wp14:editId="4AFD7A0D">
           <wp:simplePos x="0" y="0"/>
           <wp:positionH relativeFrom="column">
-            <wp:posOffset>-489585</wp:posOffset>
+            <wp:posOffset>148590</wp:posOffset>
           </wp:positionH>
           <wp:positionV relativeFrom="paragraph">
             <wp:posOffset>-278765</wp:posOffset>

</xml_diff>